<commit_message>
some edits in documentation
</commit_message>
<xml_diff>
--- a/docs/Dominator Problem Analysis.docx
+++ b/docs/Dominator Problem Analysis.docx
@@ -6,8 +6,6 @@
       <w:pPr>
         <w:spacing w:before="800"/>
         <w:jc w:val="center"/>
-      </w:pPr>
-      <w:r>
         <w:rPr>
           <w:b/>
           <w:bCs/>
@@ -15,14 +13,77 @@
           <w:color w:val="4A90C4"/>
           <w:sz w:val="24"/>
           <w:szCs w:val="24"/>
-        </w:rPr>
-        <w:t>ALGORITHM PROJECT</w:t>
-      </w:r>
+          <w:lang w:val="en-US"/>
+        </w:rPr>
+      </w:pPr>
+    </w:p>
+    <w:p>
+      <w:pPr>
+        <w:spacing w:before="800"/>
+        <w:jc w:val="center"/>
+        <w:rPr>
+          <w:b/>
+          <w:bCs/>
+          <w:caps/>
+          <w:color w:val="4A90C4"/>
+          <w:sz w:val="24"/>
+          <w:szCs w:val="24"/>
+          <w:lang w:val="en-US"/>
+        </w:rPr>
+      </w:pPr>
+    </w:p>
+    <w:p>
+      <w:pPr>
+        <w:spacing w:before="800"/>
+        <w:jc w:val="center"/>
+        <w:rPr>
+          <w:b/>
+          <w:bCs/>
+          <w:caps/>
+          <w:color w:val="4A90C4"/>
+          <w:sz w:val="24"/>
+          <w:szCs w:val="24"/>
+          <w:lang w:val="en-US"/>
+        </w:rPr>
+      </w:pPr>
+    </w:p>
+    <w:p>
+      <w:pPr>
+        <w:spacing w:before="800"/>
+        <w:jc w:val="center"/>
+        <w:rPr>
+          <w:b/>
+          <w:bCs/>
+          <w:caps/>
+          <w:color w:val="4A90C4"/>
+          <w:sz w:val="24"/>
+          <w:szCs w:val="24"/>
+          <w:lang w:val="en-US"/>
+        </w:rPr>
+      </w:pPr>
+    </w:p>
+    <w:p>
+      <w:pPr>
+        <w:spacing w:before="800"/>
+        <w:jc w:val="center"/>
+        <w:rPr>
+          <w:b/>
+          <w:bCs/>
+          <w:caps/>
+          <w:color w:val="4A90C4"/>
+          <w:sz w:val="24"/>
+          <w:szCs w:val="24"/>
+          <w:lang w:val="en-US"/>
+        </w:rPr>
+      </w:pPr>
     </w:p>
     <w:p>
       <w:pPr>
         <w:spacing w:before="120" w:after="80"/>
         <w:jc w:val="center"/>
+        <w:rPr>
+          <w:lang w:val="en-US"/>
+        </w:rPr>
       </w:pPr>
       <w:r>
         <w:rPr>
@@ -37,931 +98,11 @@
     </w:p>
     <w:p>
       <w:pPr>
-        <w:pBdr>
-          <w:bottom w:val="single" w:sz="12" w:space="8" w:color="2E6DA4"/>
-        </w:pBdr>
-        <w:spacing w:after="240"/>
-      </w:pPr>
-    </w:p>
-    <w:p>
-      <w:pPr>
         <w:rPr>
           <w:rtl/>
         </w:rPr>
       </w:pPr>
     </w:p>
-    <w:p>
-      <w:pPr>
-        <w:rPr>
-          <w:b/>
-          <w:bCs/>
-          <w:caps/>
-          <w:color w:val="1A3A5C"/>
-          <w:sz w:val="28"/>
-          <w:szCs w:val="28"/>
-          <w:rtl/>
-        </w:rPr>
-      </w:pPr>
-      <w:r>
-        <w:rPr>
-          <w:b/>
-          <w:bCs/>
-          <w:caps/>
-          <w:color w:val="1A3A5C"/>
-          <w:sz w:val="28"/>
-          <w:szCs w:val="28"/>
-        </w:rPr>
-        <w:t>TABLE OF CONTENTS</w:t>
-      </w:r>
-    </w:p>
-    <w:p/>
-    <w:sdt>
-      <w:sdtPr>
-        <w:alias w:val="Table of Contents"/>
-        <w:id w:val="-1331832365"/>
-      </w:sdtPr>
-      <w:sdtContent>
-        <w:p>
-          <w:pPr>
-            <w:pStyle w:val="TOC1"/>
-            <w:tabs>
-              <w:tab w:val="right" w:leader="dot" w:pos="9710"/>
-            </w:tabs>
-            <w:rPr>
-              <w:noProof/>
-            </w:rPr>
-          </w:pPr>
-          <w:r>
-            <w:fldChar w:fldCharType="begin"/>
-          </w:r>
-          <w:r>
-            <w:instrText>TOC \h \o "1-3"</w:instrText>
-          </w:r>
-          <w:r>
-            <w:fldChar w:fldCharType="separate"/>
-          </w:r>
-          <w:hyperlink w:anchor="_Toc229173465" w:history="1">
-            <w:r>
-              <w:rPr>
-                <w:rStyle w:val="Hyperlink"/>
-                <w:noProof/>
-              </w:rPr>
-              <w:t xml:space="preserve">1.  Iterative Approach </w:t>
-            </w:r>
-            <w:r>
-              <w:rPr>
-                <w:noProof/>
-              </w:rPr>
-              <w:tab/>
-            </w:r>
-            <w:r>
-              <w:rPr>
-                <w:noProof/>
-              </w:rPr>
-              <w:fldChar w:fldCharType="begin"/>
-            </w:r>
-            <w:r>
-              <w:rPr>
-                <w:noProof/>
-              </w:rPr>
-              <w:instrText xml:space="preserve"> PAGEREF _Toc229173465 \h </w:instrText>
-            </w:r>
-            <w:r>
-              <w:rPr>
-                <w:noProof/>
-              </w:rPr>
-            </w:r>
-            <w:r>
-              <w:rPr>
-                <w:noProof/>
-              </w:rPr>
-              <w:fldChar w:fldCharType="separate"/>
-            </w:r>
-            <w:r>
-              <w:rPr>
-                <w:noProof/>
-              </w:rPr>
-              <w:t>1</w:t>
-            </w:r>
-            <w:r>
-              <w:rPr>
-                <w:noProof/>
-              </w:rPr>
-              <w:fldChar w:fldCharType="end"/>
-            </w:r>
-          </w:hyperlink>
-        </w:p>
-        <w:p>
-          <w:pPr>
-            <w:pStyle w:val="TOC2"/>
-            <w:tabs>
-              <w:tab w:val="right" w:leader="dot" w:pos="9710"/>
-            </w:tabs>
-            <w:rPr>
-              <w:noProof/>
-            </w:rPr>
-          </w:pPr>
-          <w:hyperlink w:anchor="_Toc229173467" w:history="1">
-            <w:r>
-              <w:rPr>
-                <w:rStyle w:val="Hyperlink"/>
-                <w:noProof/>
-              </w:rPr>
-              <w:t>Pseudocode</w:t>
-            </w:r>
-            <w:r>
-              <w:rPr>
-                <w:noProof/>
-              </w:rPr>
-              <w:tab/>
-            </w:r>
-            <w:r>
-              <w:rPr>
-                <w:noProof/>
-              </w:rPr>
-              <w:fldChar w:fldCharType="begin"/>
-            </w:r>
-            <w:r>
-              <w:rPr>
-                <w:noProof/>
-              </w:rPr>
-              <w:instrText xml:space="preserve"> PAGEREF _Toc229173467 \h </w:instrText>
-            </w:r>
-            <w:r>
-              <w:rPr>
-                <w:noProof/>
-              </w:rPr>
-            </w:r>
-            <w:r>
-              <w:rPr>
-                <w:noProof/>
-              </w:rPr>
-              <w:fldChar w:fldCharType="separate"/>
-            </w:r>
-            <w:r>
-              <w:rPr>
-                <w:noProof/>
-              </w:rPr>
-              <w:t>1</w:t>
-            </w:r>
-            <w:r>
-              <w:rPr>
-                <w:noProof/>
-              </w:rPr>
-              <w:fldChar w:fldCharType="end"/>
-            </w:r>
-          </w:hyperlink>
-        </w:p>
-        <w:p>
-          <w:pPr>
-            <w:pStyle w:val="TOC2"/>
-            <w:tabs>
-              <w:tab w:val="right" w:leader="dot" w:pos="9710"/>
-            </w:tabs>
-            <w:rPr>
-              <w:noProof/>
-            </w:rPr>
-          </w:pPr>
-          <w:hyperlink w:anchor="_Toc229173468" w:history="1">
-            <w:r>
-              <w:rPr>
-                <w:rStyle w:val="Hyperlink"/>
-                <w:noProof/>
-              </w:rPr>
-              <w:t>Complexity Analysis</w:t>
-            </w:r>
-            <w:r>
-              <w:rPr>
-                <w:noProof/>
-              </w:rPr>
-              <w:tab/>
-            </w:r>
-            <w:r>
-              <w:rPr>
-                <w:noProof/>
-              </w:rPr>
-              <w:fldChar w:fldCharType="begin"/>
-            </w:r>
-            <w:r>
-              <w:rPr>
-                <w:noProof/>
-              </w:rPr>
-              <w:instrText xml:space="preserve"> PAGEREF _Toc229173468 \h </w:instrText>
-            </w:r>
-            <w:r>
-              <w:rPr>
-                <w:noProof/>
-              </w:rPr>
-            </w:r>
-            <w:r>
-              <w:rPr>
-                <w:noProof/>
-              </w:rPr>
-              <w:fldChar w:fldCharType="separate"/>
-            </w:r>
-            <w:r>
-              <w:rPr>
-                <w:noProof/>
-              </w:rPr>
-              <w:t>1</w:t>
-            </w:r>
-            <w:r>
-              <w:rPr>
-                <w:noProof/>
-              </w:rPr>
-              <w:fldChar w:fldCharType="end"/>
-            </w:r>
-          </w:hyperlink>
-        </w:p>
-        <w:p>
-          <w:pPr>
-            <w:pStyle w:val="TOC1"/>
-            <w:tabs>
-              <w:tab w:val="right" w:leader="dot" w:pos="9710"/>
-            </w:tabs>
-            <w:rPr>
-              <w:noProof/>
-            </w:rPr>
-          </w:pPr>
-          <w:hyperlink w:anchor="_Toc229173469" w:history="1">
-            <w:r>
-              <w:rPr>
-                <w:rStyle w:val="Hyperlink"/>
-                <w:noProof/>
-              </w:rPr>
-              <w:t>2.  Recursive Approach — Divide and Conquer</w:t>
-            </w:r>
-            <w:r>
-              <w:rPr>
-                <w:noProof/>
-              </w:rPr>
-              <w:tab/>
-            </w:r>
-            <w:r>
-              <w:rPr>
-                <w:noProof/>
-              </w:rPr>
-              <w:fldChar w:fldCharType="begin"/>
-            </w:r>
-            <w:r>
-              <w:rPr>
-                <w:noProof/>
-              </w:rPr>
-              <w:instrText xml:space="preserve"> PAGEREF _Toc229173469 \h </w:instrText>
-            </w:r>
-            <w:r>
-              <w:rPr>
-                <w:noProof/>
-              </w:rPr>
-            </w:r>
-            <w:r>
-              <w:rPr>
-                <w:noProof/>
-              </w:rPr>
-              <w:fldChar w:fldCharType="separate"/>
-            </w:r>
-            <w:r>
-              <w:rPr>
-                <w:noProof/>
-              </w:rPr>
-              <w:t>1</w:t>
-            </w:r>
-            <w:r>
-              <w:rPr>
-                <w:noProof/>
-              </w:rPr>
-              <w:fldChar w:fldCharType="end"/>
-            </w:r>
-          </w:hyperlink>
-        </w:p>
-        <w:p>
-          <w:pPr>
-            <w:pStyle w:val="TOC2"/>
-            <w:tabs>
-              <w:tab w:val="right" w:leader="dot" w:pos="9710"/>
-            </w:tabs>
-            <w:rPr>
-              <w:noProof/>
-            </w:rPr>
-          </w:pPr>
-          <w:hyperlink w:anchor="_Toc229173471" w:history="1">
-            <w:r>
-              <w:rPr>
-                <w:rStyle w:val="Hyperlink"/>
-                <w:noProof/>
-              </w:rPr>
-              <w:t>Pseudocode</w:t>
-            </w:r>
-            <w:r>
-              <w:rPr>
-                <w:noProof/>
-              </w:rPr>
-              <w:tab/>
-            </w:r>
-            <w:r>
-              <w:rPr>
-                <w:noProof/>
-              </w:rPr>
-              <w:fldChar w:fldCharType="begin"/>
-            </w:r>
-            <w:r>
-              <w:rPr>
-                <w:noProof/>
-              </w:rPr>
-              <w:instrText xml:space="preserve"> PAGEREF _Toc229173471 \h </w:instrText>
-            </w:r>
-            <w:r>
-              <w:rPr>
-                <w:noProof/>
-              </w:rPr>
-            </w:r>
-            <w:r>
-              <w:rPr>
-                <w:noProof/>
-              </w:rPr>
-              <w:fldChar w:fldCharType="separate"/>
-            </w:r>
-            <w:r>
-              <w:rPr>
-                <w:noProof/>
-              </w:rPr>
-              <w:t>1</w:t>
-            </w:r>
-            <w:r>
-              <w:rPr>
-                <w:noProof/>
-              </w:rPr>
-              <w:fldChar w:fldCharType="end"/>
-            </w:r>
-          </w:hyperlink>
-        </w:p>
-        <w:p>
-          <w:pPr>
-            <w:pStyle w:val="TOC2"/>
-            <w:tabs>
-              <w:tab w:val="right" w:leader="dot" w:pos="9710"/>
-            </w:tabs>
-            <w:rPr>
-              <w:noProof/>
-            </w:rPr>
-          </w:pPr>
-          <w:hyperlink w:anchor="_Toc229173472" w:history="1">
-            <w:r>
-              <w:rPr>
-                <w:rStyle w:val="Hyperlink"/>
-                <w:noProof/>
-              </w:rPr>
-              <w:t>Complexity Analysis</w:t>
-            </w:r>
-            <w:r>
-              <w:rPr>
-                <w:noProof/>
-              </w:rPr>
-              <w:tab/>
-            </w:r>
-            <w:r>
-              <w:rPr>
-                <w:noProof/>
-              </w:rPr>
-              <w:fldChar w:fldCharType="begin"/>
-            </w:r>
-            <w:r>
-              <w:rPr>
-                <w:noProof/>
-              </w:rPr>
-              <w:instrText xml:space="preserve"> PAGEREF _Toc229173472 \h </w:instrText>
-            </w:r>
-            <w:r>
-              <w:rPr>
-                <w:noProof/>
-              </w:rPr>
-            </w:r>
-            <w:r>
-              <w:rPr>
-                <w:noProof/>
-              </w:rPr>
-              <w:fldChar w:fldCharType="separate"/>
-            </w:r>
-            <w:r>
-              <w:rPr>
-                <w:noProof/>
-              </w:rPr>
-              <w:t>1</w:t>
-            </w:r>
-            <w:r>
-              <w:rPr>
-                <w:noProof/>
-              </w:rPr>
-              <w:fldChar w:fldCharType="end"/>
-            </w:r>
-          </w:hyperlink>
-        </w:p>
-        <w:p>
-          <w:pPr>
-            <w:pStyle w:val="TOC1"/>
-            <w:tabs>
-              <w:tab w:val="right" w:leader="dot" w:pos="9710"/>
-            </w:tabs>
-            <w:rPr>
-              <w:noProof/>
-            </w:rPr>
-          </w:pPr>
-          <w:hyperlink w:anchor="_Toc229173473" w:history="1">
-            <w:r>
-              <w:rPr>
-                <w:rStyle w:val="Hyperlink"/>
-                <w:noProof/>
-              </w:rPr>
-              <w:t>3.  Comparative Summary</w:t>
-            </w:r>
-            <w:r>
-              <w:rPr>
-                <w:noProof/>
-              </w:rPr>
-              <w:tab/>
-            </w:r>
-            <w:r>
-              <w:rPr>
-                <w:noProof/>
-              </w:rPr>
-              <w:fldChar w:fldCharType="begin"/>
-            </w:r>
-            <w:r>
-              <w:rPr>
-                <w:noProof/>
-              </w:rPr>
-              <w:instrText xml:space="preserve"> PAGEREF _Toc229173473 \h </w:instrText>
-            </w:r>
-            <w:r>
-              <w:rPr>
-                <w:noProof/>
-              </w:rPr>
-            </w:r>
-            <w:r>
-              <w:rPr>
-                <w:noProof/>
-              </w:rPr>
-              <w:fldChar w:fldCharType="separate"/>
-            </w:r>
-            <w:r>
-              <w:rPr>
-                <w:noProof/>
-              </w:rPr>
-              <w:t>1</w:t>
-            </w:r>
-            <w:r>
-              <w:rPr>
-                <w:noProof/>
-              </w:rPr>
-              <w:fldChar w:fldCharType="end"/>
-            </w:r>
-          </w:hyperlink>
-        </w:p>
-        <w:p>
-          <w:pPr>
-            <w:pStyle w:val="TOC1"/>
-            <w:tabs>
-              <w:tab w:val="right" w:leader="dot" w:pos="9710"/>
-            </w:tabs>
-            <w:rPr>
-              <w:noProof/>
-            </w:rPr>
-          </w:pPr>
-          <w:hyperlink w:anchor="_Toc229173474" w:history="1">
-            <w:r>
-              <w:rPr>
-                <w:rStyle w:val="Hyperlink"/>
-                <w:noProof/>
-              </w:rPr>
-              <w:t>4.  Test Case Scenarios</w:t>
-            </w:r>
-            <w:r>
-              <w:rPr>
-                <w:noProof/>
-              </w:rPr>
-              <w:tab/>
-            </w:r>
-            <w:r>
-              <w:rPr>
-                <w:noProof/>
-              </w:rPr>
-              <w:fldChar w:fldCharType="begin"/>
-            </w:r>
-            <w:r>
-              <w:rPr>
-                <w:noProof/>
-              </w:rPr>
-              <w:instrText xml:space="preserve"> PAGEREF _Toc229173474 \h </w:instrText>
-            </w:r>
-            <w:r>
-              <w:rPr>
-                <w:noProof/>
-              </w:rPr>
-            </w:r>
-            <w:r>
-              <w:rPr>
-                <w:noProof/>
-              </w:rPr>
-              <w:fldChar w:fldCharType="separate"/>
-            </w:r>
-            <w:r>
-              <w:rPr>
-                <w:noProof/>
-              </w:rPr>
-              <w:t>1</w:t>
-            </w:r>
-            <w:r>
-              <w:rPr>
-                <w:noProof/>
-              </w:rPr>
-              <w:fldChar w:fldCharType="end"/>
-            </w:r>
-          </w:hyperlink>
-        </w:p>
-        <w:p>
-          <w:pPr>
-            <w:pStyle w:val="TOC2"/>
-            <w:tabs>
-              <w:tab w:val="right" w:leader="dot" w:pos="9710"/>
-            </w:tabs>
-            <w:rPr>
-              <w:noProof/>
-            </w:rPr>
-          </w:pPr>
-          <w:hyperlink w:anchor="_Toc229173475" w:history="1">
-            <w:r>
-              <w:rPr>
-                <w:rStyle w:val="Hyperlink"/>
-                <w:noProof/>
-              </w:rPr>
-              <w:t>Case 1 — Standard Case with Dominator</w:t>
-            </w:r>
-            <w:r>
-              <w:rPr>
-                <w:noProof/>
-              </w:rPr>
-              <w:tab/>
-            </w:r>
-            <w:r>
-              <w:rPr>
-                <w:noProof/>
-              </w:rPr>
-              <w:fldChar w:fldCharType="begin"/>
-            </w:r>
-            <w:r>
-              <w:rPr>
-                <w:noProof/>
-              </w:rPr>
-              <w:instrText xml:space="preserve"> PAGEREF _Toc229173475 \h </w:instrText>
-            </w:r>
-            <w:r>
-              <w:rPr>
-                <w:noProof/>
-              </w:rPr>
-            </w:r>
-            <w:r>
-              <w:rPr>
-                <w:noProof/>
-              </w:rPr>
-              <w:fldChar w:fldCharType="separate"/>
-            </w:r>
-            <w:r>
-              <w:rPr>
-                <w:noProof/>
-              </w:rPr>
-              <w:t>1</w:t>
-            </w:r>
-            <w:r>
-              <w:rPr>
-                <w:noProof/>
-              </w:rPr>
-              <w:fldChar w:fldCharType="end"/>
-            </w:r>
-          </w:hyperlink>
-        </w:p>
-        <w:p>
-          <w:pPr>
-            <w:pStyle w:val="TOC2"/>
-            <w:tabs>
-              <w:tab w:val="right" w:leader="dot" w:pos="9710"/>
-            </w:tabs>
-            <w:rPr>
-              <w:noProof/>
-            </w:rPr>
-          </w:pPr>
-          <w:hyperlink w:anchor="_Toc229173476" w:history="1">
-            <w:r>
-              <w:rPr>
-                <w:rStyle w:val="Hyperlink"/>
-                <w:noProof/>
-              </w:rPr>
-              <w:t>Case 2 — No Dominator Exists</w:t>
-            </w:r>
-            <w:r>
-              <w:rPr>
-                <w:noProof/>
-              </w:rPr>
-              <w:tab/>
-            </w:r>
-            <w:r>
-              <w:rPr>
-                <w:noProof/>
-              </w:rPr>
-              <w:fldChar w:fldCharType="begin"/>
-            </w:r>
-            <w:r>
-              <w:rPr>
-                <w:noProof/>
-              </w:rPr>
-              <w:instrText xml:space="preserve"> PAGEREF _Toc229173476 \h </w:instrText>
-            </w:r>
-            <w:r>
-              <w:rPr>
-                <w:noProof/>
-              </w:rPr>
-            </w:r>
-            <w:r>
-              <w:rPr>
-                <w:noProof/>
-              </w:rPr>
-              <w:fldChar w:fldCharType="separate"/>
-            </w:r>
-            <w:r>
-              <w:rPr>
-                <w:noProof/>
-              </w:rPr>
-              <w:t>1</w:t>
-            </w:r>
-            <w:r>
-              <w:rPr>
-                <w:noProof/>
-              </w:rPr>
-              <w:fldChar w:fldCharType="end"/>
-            </w:r>
-          </w:hyperlink>
-        </w:p>
-        <w:p>
-          <w:pPr>
-            <w:pStyle w:val="TOC2"/>
-            <w:tabs>
-              <w:tab w:val="right" w:leader="dot" w:pos="9710"/>
-            </w:tabs>
-            <w:rPr>
-              <w:noProof/>
-            </w:rPr>
-          </w:pPr>
-          <w:hyperlink w:anchor="_Toc229173477" w:history="1">
-            <w:r>
-              <w:rPr>
-                <w:rStyle w:val="Hyperlink"/>
-                <w:noProof/>
-              </w:rPr>
-              <w:t>Case 3 — Empty Array</w:t>
-            </w:r>
-            <w:r>
-              <w:rPr>
-                <w:noProof/>
-              </w:rPr>
-              <w:tab/>
-            </w:r>
-            <w:r>
-              <w:rPr>
-                <w:noProof/>
-              </w:rPr>
-              <w:fldChar w:fldCharType="begin"/>
-            </w:r>
-            <w:r>
-              <w:rPr>
-                <w:noProof/>
-              </w:rPr>
-              <w:instrText xml:space="preserve"> PAGEREF _Toc229173477 \h </w:instrText>
-            </w:r>
-            <w:r>
-              <w:rPr>
-                <w:noProof/>
-              </w:rPr>
-            </w:r>
-            <w:r>
-              <w:rPr>
-                <w:noProof/>
-              </w:rPr>
-              <w:fldChar w:fldCharType="separate"/>
-            </w:r>
-            <w:r>
-              <w:rPr>
-                <w:noProof/>
-              </w:rPr>
-              <w:t>1</w:t>
-            </w:r>
-            <w:r>
-              <w:rPr>
-                <w:noProof/>
-              </w:rPr>
-              <w:fldChar w:fldCharType="end"/>
-            </w:r>
-          </w:hyperlink>
-        </w:p>
-        <w:p>
-          <w:pPr>
-            <w:pStyle w:val="TOC2"/>
-            <w:tabs>
-              <w:tab w:val="right" w:leader="dot" w:pos="9710"/>
-            </w:tabs>
-            <w:rPr>
-              <w:noProof/>
-            </w:rPr>
-          </w:pPr>
-          <w:hyperlink w:anchor="_Toc229173478" w:history="1">
-            <w:r>
-              <w:rPr>
-                <w:rStyle w:val="Hyperlink"/>
-                <w:noProof/>
-              </w:rPr>
-              <w:t>Case 4 — Single Element Array</w:t>
-            </w:r>
-            <w:r>
-              <w:rPr>
-                <w:noProof/>
-              </w:rPr>
-              <w:tab/>
-            </w:r>
-            <w:r>
-              <w:rPr>
-                <w:noProof/>
-              </w:rPr>
-              <w:fldChar w:fldCharType="begin"/>
-            </w:r>
-            <w:r>
-              <w:rPr>
-                <w:noProof/>
-              </w:rPr>
-              <w:instrText xml:space="preserve"> PAGEREF _Toc229173478 \h </w:instrText>
-            </w:r>
-            <w:r>
-              <w:rPr>
-                <w:noProof/>
-              </w:rPr>
-            </w:r>
-            <w:r>
-              <w:rPr>
-                <w:noProof/>
-              </w:rPr>
-              <w:fldChar w:fldCharType="separate"/>
-            </w:r>
-            <w:r>
-              <w:rPr>
-                <w:noProof/>
-              </w:rPr>
-              <w:t>1</w:t>
-            </w:r>
-            <w:r>
-              <w:rPr>
-                <w:noProof/>
-              </w:rPr>
-              <w:fldChar w:fldCharType="end"/>
-            </w:r>
-          </w:hyperlink>
-        </w:p>
-        <w:p>
-          <w:pPr>
-            <w:pStyle w:val="TOC2"/>
-            <w:tabs>
-              <w:tab w:val="right" w:leader="dot" w:pos="9710"/>
-            </w:tabs>
-            <w:rPr>
-              <w:noProof/>
-            </w:rPr>
-          </w:pPr>
-          <w:hyperlink w:anchor="_Toc229173479" w:history="1">
-            <w:r>
-              <w:rPr>
-                <w:rStyle w:val="Hyperlink"/>
-                <w:noProof/>
-              </w:rPr>
-              <w:t>Case 5 — Dominator on the Boundary</w:t>
-            </w:r>
-            <w:r>
-              <w:rPr>
-                <w:noProof/>
-              </w:rPr>
-              <w:tab/>
-            </w:r>
-            <w:r>
-              <w:rPr>
-                <w:noProof/>
-              </w:rPr>
-              <w:fldChar w:fldCharType="begin"/>
-            </w:r>
-            <w:r>
-              <w:rPr>
-                <w:noProof/>
-              </w:rPr>
-              <w:instrText xml:space="preserve"> PAGEREF _Toc229173479 \h </w:instrText>
-            </w:r>
-            <w:r>
-              <w:rPr>
-                <w:noProof/>
-              </w:rPr>
-            </w:r>
-            <w:r>
-              <w:rPr>
-                <w:noProof/>
-              </w:rPr>
-              <w:fldChar w:fldCharType="separate"/>
-            </w:r>
-            <w:r>
-              <w:rPr>
-                <w:noProof/>
-              </w:rPr>
-              <w:t>1</w:t>
-            </w:r>
-            <w:r>
-              <w:rPr>
-                <w:noProof/>
-              </w:rPr>
-              <w:fldChar w:fldCharType="end"/>
-            </w:r>
-          </w:hyperlink>
-        </w:p>
-        <w:p>
-          <w:pPr>
-            <w:pStyle w:val="TOC2"/>
-            <w:tabs>
-              <w:tab w:val="right" w:leader="dot" w:pos="9710"/>
-            </w:tabs>
-            <w:rPr>
-              <w:noProof/>
-            </w:rPr>
-          </w:pPr>
-          <w:hyperlink w:anchor="_Toc229173480" w:history="1">
-            <w:r>
-              <w:rPr>
-                <w:rStyle w:val="Hyperlink"/>
-                <w:noProof/>
-              </w:rPr>
-              <w:t>Case 6 — Negative Values with Dominator</w:t>
-            </w:r>
-            <w:r>
-              <w:rPr>
-                <w:noProof/>
-              </w:rPr>
-              <w:tab/>
-            </w:r>
-            <w:r>
-              <w:rPr>
-                <w:noProof/>
-              </w:rPr>
-              <w:fldChar w:fldCharType="begin"/>
-            </w:r>
-            <w:r>
-              <w:rPr>
-                <w:noProof/>
-              </w:rPr>
-              <w:instrText xml:space="preserve"> PAGEREF _Toc229173480 \h </w:instrText>
-            </w:r>
-            <w:r>
-              <w:rPr>
-                <w:noProof/>
-              </w:rPr>
-            </w:r>
-            <w:r>
-              <w:rPr>
-                <w:noProof/>
-              </w:rPr>
-              <w:fldChar w:fldCharType="separate"/>
-            </w:r>
-            <w:r>
-              <w:rPr>
-                <w:noProof/>
-              </w:rPr>
-              <w:t>1</w:t>
-            </w:r>
-            <w:r>
-              <w:rPr>
-                <w:noProof/>
-              </w:rPr>
-              <w:fldChar w:fldCharType="end"/>
-            </w:r>
-          </w:hyperlink>
-        </w:p>
-        <w:p>
-          <w:pPr>
-            <w:pStyle w:val="TOC2"/>
-            <w:tabs>
-              <w:tab w:val="right" w:leader="dot" w:pos="9710"/>
-            </w:tabs>
-            <w:rPr>
-              <w:noProof/>
-            </w:rPr>
-          </w:pPr>
-        </w:p>
-        <w:p>
-          <w:r>
-            <w:fldChar w:fldCharType="end"/>
-          </w:r>
-        </w:p>
-      </w:sdtContent>
-    </w:sdt>
     <w:p>
       <w:r>
         <w:br w:type="page"/>
@@ -1015,10 +156,13 @@
         <w:shd w:val="clear" w:color="auto" w:fill="1E1E2E"/>
         <w:spacing w:before="80"/>
         <w:ind w:left="360" w:right="360"/>
-      </w:pPr>
-      <w:r>
-        <w:rPr>
-          <w:rFonts w:ascii="Courier New" w:eastAsia="Courier New" w:hAnsi="Courier New" w:cs="Courier New"/>
+        <w:rPr>
+          <w:rFonts w:ascii="Consolas" w:hAnsi="Consolas"/>
+        </w:rPr>
+      </w:pPr>
+      <w:r>
+        <w:rPr>
+          <w:rFonts w:ascii="Consolas" w:eastAsia="Courier New" w:hAnsi="Consolas" w:cs="Courier New"/>
           <w:color w:val="C9D1E0"/>
           <w:sz w:val="18"/>
           <w:szCs w:val="18"/>
@@ -1033,10 +177,13 @@
         </w:pBdr>
         <w:shd w:val="clear" w:color="auto" w:fill="1E1E2E"/>
         <w:ind w:left="360" w:right="360"/>
-      </w:pPr>
-      <w:r>
-        <w:rPr>
-          <w:rFonts w:ascii="Courier New" w:eastAsia="Courier New" w:hAnsi="Courier New" w:cs="Courier New"/>
+        <w:rPr>
+          <w:rFonts w:ascii="Consolas" w:hAnsi="Consolas"/>
+        </w:rPr>
+      </w:pPr>
+      <w:r>
+        <w:rPr>
+          <w:rFonts w:ascii="Consolas" w:eastAsia="Courier New" w:hAnsi="Consolas" w:cs="Courier New"/>
           <w:color w:val="C9D1E0"/>
           <w:sz w:val="18"/>
           <w:szCs w:val="18"/>
@@ -1051,10 +198,13 @@
         </w:pBdr>
         <w:shd w:val="clear" w:color="auto" w:fill="1E1E2E"/>
         <w:ind w:left="360" w:right="360"/>
-      </w:pPr>
-      <w:r>
-        <w:rPr>
-          <w:rFonts w:ascii="Courier New" w:eastAsia="Courier New" w:hAnsi="Courier New" w:cs="Courier New"/>
+        <w:rPr>
+          <w:rFonts w:ascii="Consolas" w:hAnsi="Consolas"/>
+        </w:rPr>
+      </w:pPr>
+      <w:r>
+        <w:rPr>
+          <w:rFonts w:ascii="Consolas" w:eastAsia="Courier New" w:hAnsi="Consolas" w:cs="Courier New"/>
           <w:color w:val="C9D1E0"/>
           <w:sz w:val="18"/>
           <w:szCs w:val="18"/>
@@ -1069,10 +219,13 @@
         </w:pBdr>
         <w:shd w:val="clear" w:color="auto" w:fill="1E1E2E"/>
         <w:ind w:left="360" w:right="360"/>
-      </w:pPr>
-      <w:r>
-        <w:rPr>
-          <w:rFonts w:ascii="Courier New" w:eastAsia="Courier New" w:hAnsi="Courier New" w:cs="Courier New"/>
+        <w:rPr>
+          <w:rFonts w:ascii="Consolas" w:hAnsi="Consolas"/>
+        </w:rPr>
+      </w:pPr>
+      <w:r>
+        <w:rPr>
+          <w:rFonts w:ascii="Consolas" w:eastAsia="Courier New" w:hAnsi="Consolas" w:cs="Courier New"/>
           <w:color w:val="C9D1E0"/>
           <w:sz w:val="18"/>
           <w:szCs w:val="18"/>
@@ -1087,10 +240,13 @@
         </w:pBdr>
         <w:shd w:val="clear" w:color="auto" w:fill="1E1E2E"/>
         <w:ind w:left="360" w:right="360"/>
-      </w:pPr>
-      <w:r>
-        <w:rPr>
-          <w:rFonts w:ascii="Courier New" w:eastAsia="Courier New" w:hAnsi="Courier New" w:cs="Courier New"/>
+        <w:rPr>
+          <w:rFonts w:ascii="Consolas" w:hAnsi="Consolas"/>
+        </w:rPr>
+      </w:pPr>
+      <w:r>
+        <w:rPr>
+          <w:rFonts w:ascii="Consolas" w:eastAsia="Courier New" w:hAnsi="Consolas" w:cs="Courier New"/>
           <w:color w:val="C9D1E0"/>
           <w:sz w:val="18"/>
           <w:szCs w:val="18"/>
@@ -1105,10 +261,13 @@
         </w:pBdr>
         <w:shd w:val="clear" w:color="auto" w:fill="1E1E2E"/>
         <w:ind w:left="360" w:right="360"/>
-      </w:pPr>
-      <w:r>
-        <w:rPr>
-          <w:rFonts w:ascii="Courier New" w:eastAsia="Courier New" w:hAnsi="Courier New" w:cs="Courier New"/>
+        <w:rPr>
+          <w:rFonts w:ascii="Consolas" w:hAnsi="Consolas"/>
+        </w:rPr>
+      </w:pPr>
+      <w:r>
+        <w:rPr>
+          <w:rFonts w:ascii="Consolas" w:eastAsia="Courier New" w:hAnsi="Consolas" w:cs="Courier New"/>
           <w:color w:val="C9D1E0"/>
           <w:sz w:val="18"/>
           <w:szCs w:val="18"/>
@@ -1123,10 +282,13 @@
         </w:pBdr>
         <w:shd w:val="clear" w:color="auto" w:fill="1E1E2E"/>
         <w:ind w:left="360" w:right="360"/>
-      </w:pPr>
-      <w:r>
-        <w:rPr>
-          <w:rFonts w:ascii="Courier New" w:eastAsia="Courier New" w:hAnsi="Courier New" w:cs="Courier New"/>
+        <w:rPr>
+          <w:rFonts w:ascii="Consolas" w:hAnsi="Consolas"/>
+        </w:rPr>
+      </w:pPr>
+      <w:r>
+        <w:rPr>
+          <w:rFonts w:ascii="Consolas" w:eastAsia="Courier New" w:hAnsi="Consolas" w:cs="Courier New"/>
           <w:color w:val="C9D1E0"/>
           <w:sz w:val="18"/>
           <w:szCs w:val="18"/>
@@ -1141,10 +303,13 @@
         </w:pBdr>
         <w:shd w:val="clear" w:color="auto" w:fill="1E1E2E"/>
         <w:ind w:left="360" w:right="360"/>
-      </w:pPr>
-      <w:r>
-        <w:rPr>
-          <w:rFonts w:ascii="Courier New" w:eastAsia="Courier New" w:hAnsi="Courier New" w:cs="Courier New"/>
+        <w:rPr>
+          <w:rFonts w:ascii="Consolas" w:hAnsi="Consolas"/>
+        </w:rPr>
+      </w:pPr>
+      <w:r>
+        <w:rPr>
+          <w:rFonts w:ascii="Consolas" w:eastAsia="Courier New" w:hAnsi="Consolas" w:cs="Courier New"/>
           <w:color w:val="C9D1E0"/>
           <w:sz w:val="18"/>
           <w:szCs w:val="18"/>
@@ -1159,10 +324,13 @@
         </w:pBdr>
         <w:shd w:val="clear" w:color="auto" w:fill="1E1E2E"/>
         <w:ind w:left="360" w:right="360"/>
-      </w:pPr>
-      <w:r>
-        <w:rPr>
-          <w:rFonts w:ascii="Courier New" w:eastAsia="Courier New" w:hAnsi="Courier New" w:cs="Courier New"/>
+        <w:rPr>
+          <w:rFonts w:ascii="Consolas" w:hAnsi="Consolas"/>
+        </w:rPr>
+      </w:pPr>
+      <w:r>
+        <w:rPr>
+          <w:rFonts w:ascii="Consolas" w:eastAsia="Courier New" w:hAnsi="Consolas" w:cs="Courier New"/>
           <w:color w:val="C9D1E0"/>
           <w:sz w:val="18"/>
           <w:szCs w:val="18"/>
@@ -1177,10 +345,13 @@
         </w:pBdr>
         <w:shd w:val="clear" w:color="auto" w:fill="1E1E2E"/>
         <w:ind w:left="360" w:right="360"/>
-      </w:pPr>
-      <w:r>
-        <w:rPr>
-          <w:rFonts w:ascii="Courier New" w:eastAsia="Courier New" w:hAnsi="Courier New" w:cs="Courier New"/>
+        <w:rPr>
+          <w:rFonts w:ascii="Consolas" w:hAnsi="Consolas"/>
+        </w:rPr>
+      </w:pPr>
+      <w:r>
+        <w:rPr>
+          <w:rFonts w:ascii="Consolas" w:eastAsia="Courier New" w:hAnsi="Consolas" w:cs="Courier New"/>
           <w:color w:val="C9D1E0"/>
           <w:sz w:val="18"/>
           <w:szCs w:val="18"/>
@@ -1195,10 +366,13 @@
         </w:pBdr>
         <w:shd w:val="clear" w:color="auto" w:fill="1E1E2E"/>
         <w:ind w:left="360" w:right="360"/>
-      </w:pPr>
-      <w:r>
-        <w:rPr>
-          <w:rFonts w:ascii="Courier New" w:eastAsia="Courier New" w:hAnsi="Courier New" w:cs="Courier New"/>
+        <w:rPr>
+          <w:rFonts w:ascii="Consolas" w:hAnsi="Consolas"/>
+        </w:rPr>
+      </w:pPr>
+      <w:r>
+        <w:rPr>
+          <w:rFonts w:ascii="Consolas" w:eastAsia="Courier New" w:hAnsi="Consolas" w:cs="Courier New"/>
           <w:color w:val="C9D1E0"/>
           <w:sz w:val="18"/>
           <w:szCs w:val="18"/>
@@ -1213,10 +387,13 @@
         </w:pBdr>
         <w:shd w:val="clear" w:color="auto" w:fill="1E1E2E"/>
         <w:ind w:left="360" w:right="360"/>
-      </w:pPr>
-      <w:r>
-        <w:rPr>
-          <w:rFonts w:ascii="Courier New" w:eastAsia="Courier New" w:hAnsi="Courier New" w:cs="Courier New"/>
+        <w:rPr>
+          <w:rFonts w:ascii="Consolas" w:hAnsi="Consolas"/>
+        </w:rPr>
+      </w:pPr>
+      <w:r>
+        <w:rPr>
+          <w:rFonts w:ascii="Consolas" w:eastAsia="Courier New" w:hAnsi="Consolas" w:cs="Courier New"/>
           <w:color w:val="C9D1E0"/>
           <w:sz w:val="18"/>
           <w:szCs w:val="18"/>
@@ -1231,10 +408,13 @@
         </w:pBdr>
         <w:shd w:val="clear" w:color="auto" w:fill="1E1E2E"/>
         <w:ind w:left="360" w:right="360"/>
-      </w:pPr>
-      <w:r>
-        <w:rPr>
-          <w:rFonts w:ascii="Courier New" w:eastAsia="Courier New" w:hAnsi="Courier New" w:cs="Courier New"/>
+        <w:rPr>
+          <w:rFonts w:ascii="Consolas" w:hAnsi="Consolas"/>
+        </w:rPr>
+      </w:pPr>
+      <w:r>
+        <w:rPr>
+          <w:rFonts w:ascii="Consolas" w:eastAsia="Courier New" w:hAnsi="Consolas" w:cs="Courier New"/>
           <w:color w:val="C9D1E0"/>
           <w:sz w:val="18"/>
           <w:szCs w:val="18"/>
@@ -1249,10 +429,13 @@
         </w:pBdr>
         <w:shd w:val="clear" w:color="auto" w:fill="1E1E2E"/>
         <w:ind w:left="360" w:right="360"/>
-      </w:pPr>
-      <w:r>
-        <w:rPr>
-          <w:rFonts w:ascii="Courier New" w:eastAsia="Courier New" w:hAnsi="Courier New" w:cs="Courier New"/>
+        <w:rPr>
+          <w:rFonts w:ascii="Consolas" w:hAnsi="Consolas"/>
+        </w:rPr>
+      </w:pPr>
+      <w:r>
+        <w:rPr>
+          <w:rFonts w:ascii="Consolas" w:eastAsia="Courier New" w:hAnsi="Consolas" w:cs="Courier New"/>
           <w:color w:val="C9D1E0"/>
           <w:sz w:val="18"/>
           <w:szCs w:val="18"/>
@@ -1267,10 +450,13 @@
         </w:pBdr>
         <w:shd w:val="clear" w:color="auto" w:fill="1E1E2E"/>
         <w:ind w:left="360" w:right="360"/>
-      </w:pPr>
-      <w:r>
-        <w:rPr>
-          <w:rFonts w:ascii="Courier New" w:eastAsia="Courier New" w:hAnsi="Courier New" w:cs="Courier New"/>
+        <w:rPr>
+          <w:rFonts w:ascii="Consolas" w:hAnsi="Consolas"/>
+        </w:rPr>
+      </w:pPr>
+      <w:r>
+        <w:rPr>
+          <w:rFonts w:ascii="Consolas" w:eastAsia="Courier New" w:hAnsi="Consolas" w:cs="Courier New"/>
           <w:color w:val="C9D1E0"/>
           <w:sz w:val="18"/>
           <w:szCs w:val="18"/>
@@ -1285,10 +471,13 @@
         </w:pBdr>
         <w:shd w:val="clear" w:color="auto" w:fill="1E1E2E"/>
         <w:ind w:left="360" w:right="360"/>
-      </w:pPr>
-      <w:r>
-        <w:rPr>
-          <w:rFonts w:ascii="Courier New" w:eastAsia="Courier New" w:hAnsi="Courier New" w:cs="Courier New"/>
+        <w:rPr>
+          <w:rFonts w:ascii="Consolas" w:hAnsi="Consolas"/>
+        </w:rPr>
+      </w:pPr>
+      <w:r>
+        <w:rPr>
+          <w:rFonts w:ascii="Consolas" w:eastAsia="Courier New" w:hAnsi="Consolas" w:cs="Courier New"/>
           <w:color w:val="C9D1E0"/>
           <w:sz w:val="18"/>
           <w:szCs w:val="18"/>
@@ -1303,10 +492,13 @@
         </w:pBdr>
         <w:shd w:val="clear" w:color="auto" w:fill="1E1E2E"/>
         <w:ind w:left="360" w:right="360"/>
-      </w:pPr>
-      <w:r>
-        <w:rPr>
-          <w:rFonts w:ascii="Courier New" w:eastAsia="Courier New" w:hAnsi="Courier New" w:cs="Courier New"/>
+        <w:rPr>
+          <w:rFonts w:ascii="Consolas" w:hAnsi="Consolas"/>
+        </w:rPr>
+      </w:pPr>
+      <w:r>
+        <w:rPr>
+          <w:rFonts w:ascii="Consolas" w:eastAsia="Courier New" w:hAnsi="Consolas" w:cs="Courier New"/>
           <w:color w:val="C9D1E0"/>
           <w:sz w:val="18"/>
           <w:szCs w:val="18"/>
@@ -1321,10 +513,13 @@
         </w:pBdr>
         <w:shd w:val="clear" w:color="auto" w:fill="1E1E2E"/>
         <w:ind w:left="360" w:right="360"/>
-      </w:pPr>
-      <w:r>
-        <w:rPr>
-          <w:rFonts w:ascii="Courier New" w:eastAsia="Courier New" w:hAnsi="Courier New" w:cs="Courier New"/>
+        <w:rPr>
+          <w:rFonts w:ascii="Consolas" w:hAnsi="Consolas"/>
+        </w:rPr>
+      </w:pPr>
+      <w:r>
+        <w:rPr>
+          <w:rFonts w:ascii="Consolas" w:eastAsia="Courier New" w:hAnsi="Consolas" w:cs="Courier New"/>
           <w:color w:val="C9D1E0"/>
           <w:sz w:val="18"/>
           <w:szCs w:val="18"/>
@@ -1339,10 +534,13 @@
         </w:pBdr>
         <w:shd w:val="clear" w:color="auto" w:fill="1E1E2E"/>
         <w:ind w:left="360" w:right="360"/>
-      </w:pPr>
-      <w:r>
-        <w:rPr>
-          <w:rFonts w:ascii="Courier New" w:eastAsia="Courier New" w:hAnsi="Courier New" w:cs="Courier New"/>
+        <w:rPr>
+          <w:rFonts w:ascii="Consolas" w:hAnsi="Consolas"/>
+        </w:rPr>
+      </w:pPr>
+      <w:r>
+        <w:rPr>
+          <w:rFonts w:ascii="Consolas" w:eastAsia="Courier New" w:hAnsi="Consolas" w:cs="Courier New"/>
           <w:color w:val="C9D1E0"/>
           <w:sz w:val="18"/>
           <w:szCs w:val="18"/>
@@ -1357,10 +555,13 @@
         </w:pBdr>
         <w:shd w:val="clear" w:color="auto" w:fill="1E1E2E"/>
         <w:ind w:left="360" w:right="360"/>
-      </w:pPr>
-      <w:r>
-        <w:rPr>
-          <w:rFonts w:ascii="Courier New" w:eastAsia="Courier New" w:hAnsi="Courier New" w:cs="Courier New"/>
+        <w:rPr>
+          <w:rFonts w:ascii="Consolas" w:hAnsi="Consolas"/>
+        </w:rPr>
+      </w:pPr>
+      <w:r>
+        <w:rPr>
+          <w:rFonts w:ascii="Consolas" w:eastAsia="Courier New" w:hAnsi="Consolas" w:cs="Courier New"/>
           <w:color w:val="C9D1E0"/>
           <w:sz w:val="18"/>
           <w:szCs w:val="18"/>
@@ -1375,10 +576,13 @@
         </w:pBdr>
         <w:shd w:val="clear" w:color="auto" w:fill="1E1E2E"/>
         <w:ind w:left="360" w:right="360"/>
-      </w:pPr>
-      <w:r>
-        <w:rPr>
-          <w:rFonts w:ascii="Courier New" w:eastAsia="Courier New" w:hAnsi="Courier New" w:cs="Courier New"/>
+        <w:rPr>
+          <w:rFonts w:ascii="Consolas" w:hAnsi="Consolas"/>
+        </w:rPr>
+      </w:pPr>
+      <w:r>
+        <w:rPr>
+          <w:rFonts w:ascii="Consolas" w:eastAsia="Courier New" w:hAnsi="Consolas" w:cs="Courier New"/>
           <w:color w:val="C9D1E0"/>
           <w:sz w:val="18"/>
           <w:szCs w:val="18"/>
@@ -1393,10 +597,13 @@
         </w:pBdr>
         <w:shd w:val="clear" w:color="auto" w:fill="1E1E2E"/>
         <w:ind w:left="360" w:right="360"/>
-      </w:pPr>
-      <w:r>
-        <w:rPr>
-          <w:rFonts w:ascii="Courier New" w:eastAsia="Courier New" w:hAnsi="Courier New" w:cs="Courier New"/>
+        <w:rPr>
+          <w:rFonts w:ascii="Consolas" w:hAnsi="Consolas"/>
+        </w:rPr>
+      </w:pPr>
+      <w:r>
+        <w:rPr>
+          <w:rFonts w:ascii="Consolas" w:eastAsia="Courier New" w:hAnsi="Consolas" w:cs="Courier New"/>
           <w:color w:val="C9D1E0"/>
           <w:sz w:val="18"/>
           <w:szCs w:val="18"/>
@@ -1411,10 +618,13 @@
         </w:pBdr>
         <w:shd w:val="clear" w:color="auto" w:fill="1E1E2E"/>
         <w:ind w:left="360" w:right="360"/>
-      </w:pPr>
-      <w:r>
-        <w:rPr>
-          <w:rFonts w:ascii="Courier New" w:eastAsia="Courier New" w:hAnsi="Courier New" w:cs="Courier New"/>
+        <w:rPr>
+          <w:rFonts w:ascii="Consolas" w:hAnsi="Consolas"/>
+        </w:rPr>
+      </w:pPr>
+      <w:r>
+        <w:rPr>
+          <w:rFonts w:ascii="Consolas" w:eastAsia="Courier New" w:hAnsi="Consolas" w:cs="Courier New"/>
           <w:color w:val="C9D1E0"/>
           <w:sz w:val="18"/>
           <w:szCs w:val="18"/>
@@ -1429,10 +639,13 @@
         </w:pBdr>
         <w:shd w:val="clear" w:color="auto" w:fill="1E1E2E"/>
         <w:ind w:left="360" w:right="360"/>
-      </w:pPr>
-      <w:r>
-        <w:rPr>
-          <w:rFonts w:ascii="Courier New" w:eastAsia="Courier New" w:hAnsi="Courier New" w:cs="Courier New"/>
+        <w:rPr>
+          <w:rFonts w:ascii="Consolas" w:hAnsi="Consolas"/>
+        </w:rPr>
+      </w:pPr>
+      <w:r>
+        <w:rPr>
+          <w:rFonts w:ascii="Consolas" w:eastAsia="Courier New" w:hAnsi="Consolas" w:cs="Courier New"/>
           <w:color w:val="C9D1E0"/>
           <w:sz w:val="18"/>
           <w:szCs w:val="18"/>
@@ -1449,10 +662,13 @@
         <w:shd w:val="clear" w:color="auto" w:fill="1E1E2E"/>
         <w:spacing w:after="80"/>
         <w:ind w:left="360" w:right="360"/>
-      </w:pPr>
-      <w:r>
-        <w:rPr>
-          <w:rFonts w:ascii="Courier New" w:eastAsia="Courier New" w:hAnsi="Courier New" w:cs="Courier New"/>
+        <w:rPr>
+          <w:rFonts w:ascii="Consolas" w:hAnsi="Consolas"/>
+        </w:rPr>
+      </w:pPr>
+      <w:r>
+        <w:rPr>
+          <w:rFonts w:ascii="Consolas" w:eastAsia="Courier New" w:hAnsi="Consolas" w:cs="Courier New"/>
           <w:color w:val="C9D1E0"/>
           <w:sz w:val="18"/>
           <w:szCs w:val="18"/>
@@ -1494,8 +710,8 @@
       </w:tblPr>
       <w:tblGrid>
         <w:gridCol w:w="2200"/>
-        <w:gridCol w:w="3580"/>
-        <w:gridCol w:w="3580"/>
+        <w:gridCol w:w="2929"/>
+        <w:gridCol w:w="4231"/>
       </w:tblGrid>
       <w:tr>
         <w:tblPrEx>
@@ -1525,8 +741,14 @@
             </w:tcMar>
           </w:tcPr>
           <w:p>
-            <w:r>
-              <w:rPr>
+            <w:pPr>
+              <w:rPr>
+                <w:rFonts w:ascii="Consolas" w:hAnsi="Consolas"/>
+              </w:rPr>
+            </w:pPr>
+            <w:r>
+              <w:rPr>
+                <w:rFonts w:ascii="Consolas" w:hAnsi="Consolas"/>
                 <w:b/>
                 <w:bCs/>
                 <w:color w:val="FFFFFF"/>
@@ -1539,7 +761,7 @@
         </w:tc>
         <w:tc>
           <w:tcPr>
-            <w:tcW w:w="3580" w:type="dxa"/>
+            <w:tcW w:w="2929" w:type="dxa"/>
             <w:tcBorders>
               <w:top w:val="single" w:sz="1" w:space="0" w:color="C8D8E8"/>
               <w:left w:val="single" w:sz="1" w:space="0" w:color="C8D8E8"/>
@@ -1555,8 +777,14 @@
             </w:tcMar>
           </w:tcPr>
           <w:p>
-            <w:r>
-              <w:rPr>
+            <w:pPr>
+              <w:rPr>
+                <w:rFonts w:ascii="Consolas" w:hAnsi="Consolas"/>
+              </w:rPr>
+            </w:pPr>
+            <w:r>
+              <w:rPr>
+                <w:rFonts w:ascii="Consolas" w:hAnsi="Consolas"/>
                 <w:b/>
                 <w:bCs/>
                 <w:color w:val="FFFFFF"/>
@@ -1569,7 +797,7 @@
         </w:tc>
         <w:tc>
           <w:tcPr>
-            <w:tcW w:w="3580" w:type="dxa"/>
+            <w:tcW w:w="4231" w:type="dxa"/>
             <w:tcBorders>
               <w:top w:val="single" w:sz="1" w:space="0" w:color="C8D8E8"/>
               <w:left w:val="single" w:sz="1" w:space="0" w:color="C8D8E8"/>
@@ -1585,8 +813,14 @@
             </w:tcMar>
           </w:tcPr>
           <w:p>
-            <w:r>
-              <w:rPr>
+            <w:pPr>
+              <w:rPr>
+                <w:rFonts w:ascii="Consolas" w:hAnsi="Consolas"/>
+              </w:rPr>
+            </w:pPr>
+            <w:r>
+              <w:rPr>
+                <w:rFonts w:ascii="Consolas" w:hAnsi="Consolas"/>
                 <w:b/>
                 <w:bCs/>
                 <w:color w:val="FFFFFF"/>
@@ -1623,8 +857,14 @@
             </w:tcMar>
           </w:tcPr>
           <w:p>
-            <w:r>
-              <w:rPr>
+            <w:pPr>
+              <w:rPr>
+                <w:rFonts w:ascii="Consolas" w:hAnsi="Consolas"/>
+              </w:rPr>
+            </w:pPr>
+            <w:r>
+              <w:rPr>
+                <w:rFonts w:ascii="Consolas" w:hAnsi="Consolas"/>
                 <w:b/>
                 <w:bCs/>
                 <w:sz w:val="19"/>
@@ -1636,7 +876,7 @@
         </w:tc>
         <w:tc>
           <w:tcPr>
-            <w:tcW w:w="3580" w:type="dxa"/>
+            <w:tcW w:w="2929" w:type="dxa"/>
             <w:tcBorders>
               <w:top w:val="single" w:sz="1" w:space="0" w:color="C8D8E8"/>
               <w:left w:val="single" w:sz="1" w:space="0" w:color="C8D8E8"/>
@@ -1652,9 +892,14 @@
             </w:tcMar>
           </w:tcPr>
           <w:p>
-            <w:r>
-              <w:rPr>
-                <w:rFonts w:ascii="Courier New" w:eastAsia="Courier New" w:hAnsi="Courier New" w:cs="Courier New"/>
+            <w:pPr>
+              <w:rPr>
+                <w:rFonts w:ascii="Consolas" w:hAnsi="Consolas"/>
+              </w:rPr>
+            </w:pPr>
+            <w:r>
+              <w:rPr>
+                <w:rFonts w:ascii="Consolas" w:eastAsia="Courier New" w:hAnsi="Consolas" w:cs="Courier New"/>
                 <w:b/>
                 <w:bCs/>
                 <w:color w:val="1D6A40"/>
@@ -1665,7 +910,7 @@
         </w:tc>
         <w:tc>
           <w:tcPr>
-            <w:tcW w:w="3580" w:type="dxa"/>
+            <w:tcW w:w="4231" w:type="dxa"/>
             <w:tcBorders>
               <w:top w:val="single" w:sz="1" w:space="0" w:color="C8D8E8"/>
               <w:left w:val="single" w:sz="1" w:space="0" w:color="C8D8E8"/>
@@ -1681,8 +926,14 @@
             </w:tcMar>
           </w:tcPr>
           <w:p>
-            <w:r>
-              <w:rPr>
+            <w:pPr>
+              <w:rPr>
+                <w:rFonts w:ascii="Consolas" w:hAnsi="Consolas"/>
+              </w:rPr>
+            </w:pPr>
+            <w:r>
+              <w:rPr>
+                <w:rFonts w:ascii="Consolas" w:hAnsi="Consolas"/>
                 <w:sz w:val="19"/>
                 <w:szCs w:val="19"/>
               </w:rPr>
@@ -1716,8 +967,14 @@
             </w:tcMar>
           </w:tcPr>
           <w:p>
-            <w:r>
-              <w:rPr>
+            <w:pPr>
+              <w:rPr>
+                <w:rFonts w:ascii="Consolas" w:hAnsi="Consolas"/>
+              </w:rPr>
+            </w:pPr>
+            <w:r>
+              <w:rPr>
+                <w:rFonts w:ascii="Consolas" w:hAnsi="Consolas"/>
                 <w:b/>
                 <w:bCs/>
                 <w:sz w:val="19"/>
@@ -1729,7 +986,7 @@
         </w:tc>
         <w:tc>
           <w:tcPr>
-            <w:tcW w:w="3580" w:type="dxa"/>
+            <w:tcW w:w="2929" w:type="dxa"/>
             <w:tcBorders>
               <w:top w:val="single" w:sz="1" w:space="0" w:color="C8D8E8"/>
               <w:left w:val="single" w:sz="1" w:space="0" w:color="C8D8E8"/>
@@ -1745,9 +1002,14 @@
             </w:tcMar>
           </w:tcPr>
           <w:p>
-            <w:r>
-              <w:rPr>
-                <w:rFonts w:ascii="Courier New" w:eastAsia="Courier New" w:hAnsi="Courier New" w:cs="Courier New"/>
+            <w:pPr>
+              <w:rPr>
+                <w:rFonts w:ascii="Consolas" w:hAnsi="Consolas"/>
+              </w:rPr>
+            </w:pPr>
+            <w:r>
+              <w:rPr>
+                <w:rFonts w:ascii="Consolas" w:eastAsia="Courier New" w:hAnsi="Consolas" w:cs="Courier New"/>
                 <w:b/>
                 <w:bCs/>
                 <w:color w:val="1D6A40"/>
@@ -1758,7 +1020,7 @@
         </w:tc>
         <w:tc>
           <w:tcPr>
-            <w:tcW w:w="3580" w:type="dxa"/>
+            <w:tcW w:w="4231" w:type="dxa"/>
             <w:tcBorders>
               <w:top w:val="single" w:sz="1" w:space="0" w:color="C8D8E8"/>
               <w:left w:val="single" w:sz="1" w:space="0" w:color="C8D8E8"/>
@@ -1774,8 +1036,14 @@
             </w:tcMar>
           </w:tcPr>
           <w:p>
-            <w:r>
-              <w:rPr>
+            <w:pPr>
+              <w:rPr>
+                <w:rFonts w:ascii="Consolas" w:hAnsi="Consolas"/>
+              </w:rPr>
+            </w:pPr>
+            <w:r>
+              <w:rPr>
+                <w:rFonts w:ascii="Consolas" w:hAnsi="Consolas"/>
                 <w:sz w:val="19"/>
                 <w:szCs w:val="19"/>
               </w:rPr>
@@ -1803,7 +1071,7 @@
       </w:r>
       <w:r>
         <w:rPr>
-          <w:rFonts w:ascii="Courier New" w:eastAsia="Courier New" w:hAnsi="Courier New" w:cs="Courier New"/>
+          <w:rFonts w:ascii="Consolas" w:eastAsia="Courier New" w:hAnsi="Consolas" w:cs="Courier New"/>
           <w:color w:val="2E6DA4"/>
           <w:sz w:val="19"/>
           <w:szCs w:val="19"/>
@@ -1812,11 +1080,14 @@
         <w:t>candidate</w:t>
       </w:r>
       <w:r>
+        <w:rPr>
+          <w:rFonts w:ascii="Consolas" w:hAnsi="Consolas"/>
+        </w:rPr>
         <w:t xml:space="preserve">,  </w:t>
       </w:r>
       <w:r>
         <w:rPr>
-          <w:rFonts w:ascii="Courier New" w:eastAsia="Courier New" w:hAnsi="Courier New" w:cs="Courier New"/>
+          <w:rFonts w:ascii="Consolas" w:eastAsia="Courier New" w:hAnsi="Consolas" w:cs="Courier New"/>
           <w:color w:val="2E6DA4"/>
           <w:sz w:val="19"/>
           <w:szCs w:val="19"/>
@@ -1825,11 +1096,14 @@
         <w:t>count</w:t>
       </w:r>
       <w:r>
+        <w:rPr>
+          <w:rFonts w:ascii="Consolas" w:hAnsi="Consolas"/>
+        </w:rPr>
         <w:t xml:space="preserve">,  </w:t>
       </w:r>
       <w:r>
         <w:rPr>
-          <w:rFonts w:ascii="Courier New" w:eastAsia="Courier New" w:hAnsi="Courier New" w:cs="Courier New"/>
+          <w:rFonts w:ascii="Consolas" w:eastAsia="Courier New" w:hAnsi="Consolas" w:cs="Courier New"/>
           <w:color w:val="2E6DA4"/>
           <w:sz w:val="19"/>
           <w:szCs w:val="19"/>
@@ -1879,10 +1153,13 @@
         <w:shd w:val="clear" w:color="auto" w:fill="1E1E2E"/>
         <w:spacing w:before="80"/>
         <w:ind w:left="360" w:right="360"/>
-      </w:pPr>
-      <w:r>
-        <w:rPr>
-          <w:rFonts w:ascii="Courier New" w:eastAsia="Courier New" w:hAnsi="Courier New" w:cs="Courier New"/>
+        <w:rPr>
+          <w:rFonts w:ascii="Consolas" w:hAnsi="Consolas"/>
+        </w:rPr>
+      </w:pPr>
+      <w:r>
+        <w:rPr>
+          <w:rFonts w:ascii="Consolas" w:eastAsia="Courier New" w:hAnsi="Consolas" w:cs="Courier New"/>
           <w:color w:val="C9D1E0"/>
           <w:sz w:val="18"/>
           <w:szCs w:val="18"/>
@@ -1897,15 +1174,18 @@
         </w:pBdr>
         <w:shd w:val="clear" w:color="auto" w:fill="1E1E2E"/>
         <w:ind w:left="360" w:right="360"/>
-      </w:pPr>
-      <w:r>
-        <w:rPr>
-          <w:rFonts w:ascii="Courier New" w:eastAsia="Courier New" w:hAnsi="Courier New" w:cs="Courier New"/>
+        <w:rPr>
+          <w:rFonts w:ascii="Consolas" w:hAnsi="Consolas"/>
+        </w:rPr>
+      </w:pPr>
+      <w:r>
+        <w:rPr>
+          <w:rFonts w:ascii="Consolas" w:eastAsia="Courier New" w:hAnsi="Consolas" w:cs="Courier New"/>
           <w:color w:val="C9D1E0"/>
           <w:sz w:val="18"/>
           <w:szCs w:val="18"/>
         </w:rPr>
-        <w:t xml:space="preserve">    // Base Case: Single element</w:t>
+        <w:t xml:space="preserve">    IF left == right:</w:t>
       </w:r>
     </w:p>
     <w:p>
@@ -1915,15 +1195,18 @@
         </w:pBdr>
         <w:shd w:val="clear" w:color="auto" w:fill="1E1E2E"/>
         <w:ind w:left="360" w:right="360"/>
-      </w:pPr>
-      <w:r>
-        <w:rPr>
-          <w:rFonts w:ascii="Courier New" w:eastAsia="Courier New" w:hAnsi="Courier New" w:cs="Courier New"/>
+        <w:rPr>
+          <w:rFonts w:ascii="Consolas" w:hAnsi="Consolas"/>
+        </w:rPr>
+      </w:pPr>
+      <w:r>
+        <w:rPr>
+          <w:rFonts w:ascii="Consolas" w:eastAsia="Courier New" w:hAnsi="Consolas" w:cs="Courier New"/>
           <w:color w:val="C9D1E0"/>
           <w:sz w:val="18"/>
           <w:szCs w:val="18"/>
         </w:rPr>
-        <w:t xml:space="preserve">    IF left == right:</w:t>
+        <w:t xml:space="preserve">        RETURN A[left]</w:t>
       </w:r>
     </w:p>
     <w:p>
@@ -1933,15 +1216,18 @@
         </w:pBdr>
         <w:shd w:val="clear" w:color="auto" w:fill="1E1E2E"/>
         <w:ind w:left="360" w:right="360"/>
-      </w:pPr>
-      <w:r>
-        <w:rPr>
-          <w:rFonts w:ascii="Courier New" w:eastAsia="Courier New" w:hAnsi="Courier New" w:cs="Courier New"/>
+        <w:rPr>
+          <w:rFonts w:ascii="Consolas" w:hAnsi="Consolas"/>
+        </w:rPr>
+      </w:pPr>
+      <w:r>
+        <w:rPr>
+          <w:rFonts w:ascii="Consolas" w:eastAsia="Courier New" w:hAnsi="Consolas" w:cs="Courier New"/>
           <w:color w:val="C9D1E0"/>
           <w:sz w:val="18"/>
           <w:szCs w:val="18"/>
         </w:rPr>
-        <w:t xml:space="preserve">        RETURN A[left]</w:t>
+        <w:t xml:space="preserve"> </w:t>
       </w:r>
     </w:p>
     <w:p>
@@ -1951,15 +1237,18 @@
         </w:pBdr>
         <w:shd w:val="clear" w:color="auto" w:fill="1E1E2E"/>
         <w:ind w:left="360" w:right="360"/>
-      </w:pPr>
-      <w:r>
-        <w:rPr>
-          <w:rFonts w:ascii="Courier New" w:eastAsia="Courier New" w:hAnsi="Courier New" w:cs="Courier New"/>
+        <w:rPr>
+          <w:rFonts w:ascii="Consolas" w:hAnsi="Consolas"/>
+        </w:rPr>
+      </w:pPr>
+      <w:r>
+        <w:rPr>
+          <w:rFonts w:ascii="Consolas" w:eastAsia="Courier New" w:hAnsi="Consolas" w:cs="Courier New"/>
           <w:color w:val="C9D1E0"/>
           <w:sz w:val="18"/>
           <w:szCs w:val="18"/>
         </w:rPr>
-        <w:t xml:space="preserve"> </w:t>
+        <w:t xml:space="preserve">    mid &lt;- (left + right) / 2</w:t>
       </w:r>
     </w:p>
     <w:p>
@@ -1969,15 +1258,18 @@
         </w:pBdr>
         <w:shd w:val="clear" w:color="auto" w:fill="1E1E2E"/>
         <w:ind w:left="360" w:right="360"/>
-      </w:pPr>
-      <w:r>
-        <w:rPr>
-          <w:rFonts w:ascii="Courier New" w:eastAsia="Courier New" w:hAnsi="Courier New" w:cs="Courier New"/>
+        <w:rPr>
+          <w:rFonts w:ascii="Consolas" w:hAnsi="Consolas"/>
+        </w:rPr>
+      </w:pPr>
+      <w:r>
+        <w:rPr>
+          <w:rFonts w:ascii="Consolas" w:eastAsia="Courier New" w:hAnsi="Consolas" w:cs="Courier New"/>
           <w:color w:val="C9D1E0"/>
           <w:sz w:val="18"/>
           <w:szCs w:val="18"/>
         </w:rPr>
-        <w:t xml:space="preserve">    mid &lt;- (left + right) / 2</w:t>
+        <w:t xml:space="preserve"> </w:t>
       </w:r>
     </w:p>
     <w:p>
@@ -1987,15 +1279,18 @@
         </w:pBdr>
         <w:shd w:val="clear" w:color="auto" w:fill="1E1E2E"/>
         <w:ind w:left="360" w:right="360"/>
-      </w:pPr>
-      <w:r>
-        <w:rPr>
-          <w:rFonts w:ascii="Courier New" w:eastAsia="Courier New" w:hAnsi="Courier New" w:cs="Courier New"/>
+        <w:rPr>
+          <w:rFonts w:ascii="Consolas" w:hAnsi="Consolas"/>
+        </w:rPr>
+      </w:pPr>
+      <w:r>
+        <w:rPr>
+          <w:rFonts w:ascii="Consolas" w:eastAsia="Courier New" w:hAnsi="Consolas" w:cs="Courier New"/>
           <w:color w:val="C9D1E0"/>
           <w:sz w:val="18"/>
           <w:szCs w:val="18"/>
         </w:rPr>
-        <w:t xml:space="preserve"> </w:t>
+        <w:t xml:space="preserve">    left_dom  &lt;- dominator_recursive(A, left, mid)</w:t>
       </w:r>
     </w:p>
     <w:p>
@@ -2005,15 +1300,18 @@
         </w:pBdr>
         <w:shd w:val="clear" w:color="auto" w:fill="1E1E2E"/>
         <w:ind w:left="360" w:right="360"/>
-      </w:pPr>
-      <w:r>
-        <w:rPr>
-          <w:rFonts w:ascii="Courier New" w:eastAsia="Courier New" w:hAnsi="Courier New" w:cs="Courier New"/>
+        <w:rPr>
+          <w:rFonts w:ascii="Consolas" w:hAnsi="Consolas"/>
+        </w:rPr>
+      </w:pPr>
+      <w:r>
+        <w:rPr>
+          <w:rFonts w:ascii="Consolas" w:eastAsia="Courier New" w:hAnsi="Consolas" w:cs="Courier New"/>
           <w:color w:val="C9D1E0"/>
           <w:sz w:val="18"/>
           <w:szCs w:val="18"/>
         </w:rPr>
-        <w:t xml:space="preserve">    // Recursive Calls</w:t>
+        <w:t xml:space="preserve">    right_dom &lt;- dominator_recursive(A, mid + 1, right)</w:t>
       </w:r>
     </w:p>
     <w:p>
@@ -2023,15 +1321,18 @@
         </w:pBdr>
         <w:shd w:val="clear" w:color="auto" w:fill="1E1E2E"/>
         <w:ind w:left="360" w:right="360"/>
-      </w:pPr>
-      <w:r>
-        <w:rPr>
-          <w:rFonts w:ascii="Courier New" w:eastAsia="Courier New" w:hAnsi="Courier New" w:cs="Courier New"/>
+        <w:rPr>
+          <w:rFonts w:ascii="Consolas" w:hAnsi="Consolas"/>
+        </w:rPr>
+      </w:pPr>
+      <w:r>
+        <w:rPr>
+          <w:rFonts w:ascii="Consolas" w:eastAsia="Courier New" w:hAnsi="Consolas" w:cs="Courier New"/>
           <w:color w:val="C9D1E0"/>
           <w:sz w:val="18"/>
           <w:szCs w:val="18"/>
         </w:rPr>
-        <w:t xml:space="preserve">    left_dom  &lt;- dominator_recursive(A, left, mid)</w:t>
+        <w:t xml:space="preserve"> </w:t>
       </w:r>
     </w:p>
     <w:p>
@@ -2041,15 +1342,18 @@
         </w:pBdr>
         <w:shd w:val="clear" w:color="auto" w:fill="1E1E2E"/>
         <w:ind w:left="360" w:right="360"/>
-      </w:pPr>
-      <w:r>
-        <w:rPr>
-          <w:rFonts w:ascii="Courier New" w:eastAsia="Courier New" w:hAnsi="Courier New" w:cs="Courier New"/>
+        <w:rPr>
+          <w:rFonts w:ascii="Consolas" w:hAnsi="Consolas"/>
+        </w:rPr>
+      </w:pPr>
+      <w:r>
+        <w:rPr>
+          <w:rFonts w:ascii="Consolas" w:eastAsia="Courier New" w:hAnsi="Consolas" w:cs="Courier New"/>
           <w:color w:val="C9D1E0"/>
           <w:sz w:val="18"/>
           <w:szCs w:val="18"/>
         </w:rPr>
-        <w:t xml:space="preserve">    right_dom &lt;- dominator_recursive(A, mid + 1, right)</w:t>
+        <w:t xml:space="preserve">    IF left_dom == right_dom:</w:t>
       </w:r>
     </w:p>
     <w:p>
@@ -2059,15 +1363,18 @@
         </w:pBdr>
         <w:shd w:val="clear" w:color="auto" w:fill="1E1E2E"/>
         <w:ind w:left="360" w:right="360"/>
-      </w:pPr>
-      <w:r>
-        <w:rPr>
-          <w:rFonts w:ascii="Courier New" w:eastAsia="Courier New" w:hAnsi="Courier New" w:cs="Courier New"/>
+        <w:rPr>
+          <w:rFonts w:ascii="Consolas" w:hAnsi="Consolas"/>
+        </w:rPr>
+      </w:pPr>
+      <w:r>
+        <w:rPr>
+          <w:rFonts w:ascii="Consolas" w:eastAsia="Courier New" w:hAnsi="Consolas" w:cs="Courier New"/>
           <w:color w:val="C9D1E0"/>
           <w:sz w:val="18"/>
           <w:szCs w:val="18"/>
         </w:rPr>
-        <w:t xml:space="preserve"> </w:t>
+        <w:t xml:space="preserve">        RETURN left_dom</w:t>
       </w:r>
     </w:p>
     <w:p>
@@ -2077,15 +1384,18 @@
         </w:pBdr>
         <w:shd w:val="clear" w:color="auto" w:fill="1E1E2E"/>
         <w:ind w:left="360" w:right="360"/>
-      </w:pPr>
-      <w:r>
-        <w:rPr>
-          <w:rFonts w:ascii="Courier New" w:eastAsia="Courier New" w:hAnsi="Courier New" w:cs="Courier New"/>
+        <w:rPr>
+          <w:rFonts w:ascii="Consolas" w:hAnsi="Consolas"/>
+        </w:rPr>
+      </w:pPr>
+      <w:r>
+        <w:rPr>
+          <w:rFonts w:ascii="Consolas" w:eastAsia="Courier New" w:hAnsi="Consolas" w:cs="Courier New"/>
           <w:color w:val="C9D1E0"/>
           <w:sz w:val="18"/>
           <w:szCs w:val="18"/>
         </w:rPr>
-        <w:t xml:space="preserve">    // Resolution</w:t>
+        <w:t xml:space="preserve"> </w:t>
       </w:r>
     </w:p>
     <w:p>
@@ -2095,15 +1405,18 @@
         </w:pBdr>
         <w:shd w:val="clear" w:color="auto" w:fill="1E1E2E"/>
         <w:ind w:left="360" w:right="360"/>
-      </w:pPr>
-      <w:r>
-        <w:rPr>
-          <w:rFonts w:ascii="Courier New" w:eastAsia="Courier New" w:hAnsi="Courier New" w:cs="Courier New"/>
+        <w:rPr>
+          <w:rFonts w:ascii="Consolas" w:hAnsi="Consolas"/>
+        </w:rPr>
+      </w:pPr>
+      <w:r>
+        <w:rPr>
+          <w:rFonts w:ascii="Consolas" w:eastAsia="Courier New" w:hAnsi="Consolas" w:cs="Courier New"/>
           <w:color w:val="C9D1E0"/>
           <w:sz w:val="18"/>
           <w:szCs w:val="18"/>
         </w:rPr>
-        <w:t xml:space="preserve">    IF left_dom == right_dom:</w:t>
+        <w:t xml:space="preserve">    left_count  &lt;- 0</w:t>
       </w:r>
     </w:p>
     <w:p>
@@ -2113,15 +1426,18 @@
         </w:pBdr>
         <w:shd w:val="clear" w:color="auto" w:fill="1E1E2E"/>
         <w:ind w:left="360" w:right="360"/>
-      </w:pPr>
-      <w:r>
-        <w:rPr>
-          <w:rFonts w:ascii="Courier New" w:eastAsia="Courier New" w:hAnsi="Courier New" w:cs="Courier New"/>
+        <w:rPr>
+          <w:rFonts w:ascii="Consolas" w:hAnsi="Consolas"/>
+        </w:rPr>
+      </w:pPr>
+      <w:r>
+        <w:rPr>
+          <w:rFonts w:ascii="Consolas" w:eastAsia="Courier New" w:hAnsi="Consolas" w:cs="Courier New"/>
           <w:color w:val="C9D1E0"/>
           <w:sz w:val="18"/>
           <w:szCs w:val="18"/>
         </w:rPr>
-        <w:t xml:space="preserve">        RETURN left_dom</w:t>
+        <w:t xml:space="preserve">    right_count &lt;- 0</w:t>
       </w:r>
     </w:p>
     <w:p>
@@ -2131,15 +1447,18 @@
         </w:pBdr>
         <w:shd w:val="clear" w:color="auto" w:fill="1E1E2E"/>
         <w:ind w:left="360" w:right="360"/>
-      </w:pPr>
-      <w:r>
-        <w:rPr>
-          <w:rFonts w:ascii="Courier New" w:eastAsia="Courier New" w:hAnsi="Courier New" w:cs="Courier New"/>
+        <w:rPr>
+          <w:rFonts w:ascii="Consolas" w:hAnsi="Consolas"/>
+        </w:rPr>
+      </w:pPr>
+      <w:r>
+        <w:rPr>
+          <w:rFonts w:ascii="Consolas" w:eastAsia="Courier New" w:hAnsi="Consolas" w:cs="Courier New"/>
           <w:color w:val="C9D1E0"/>
           <w:sz w:val="18"/>
           <w:szCs w:val="18"/>
         </w:rPr>
-        <w:t xml:space="preserve"> </w:t>
+        <w:t xml:space="preserve">    FOR i FROM left TO right:</w:t>
       </w:r>
     </w:p>
     <w:p>
@@ -2149,15 +1468,18 @@
         </w:pBdr>
         <w:shd w:val="clear" w:color="auto" w:fill="1E1E2E"/>
         <w:ind w:left="360" w:right="360"/>
-      </w:pPr>
-      <w:r>
-        <w:rPr>
-          <w:rFonts w:ascii="Courier New" w:eastAsia="Courier New" w:hAnsi="Courier New" w:cs="Courier New"/>
+        <w:rPr>
+          <w:rFonts w:ascii="Consolas" w:hAnsi="Consolas"/>
+        </w:rPr>
+      </w:pPr>
+      <w:r>
+        <w:rPr>
+          <w:rFonts w:ascii="Consolas" w:eastAsia="Courier New" w:hAnsi="Consolas" w:cs="Courier New"/>
           <w:color w:val="C9D1E0"/>
           <w:sz w:val="18"/>
           <w:szCs w:val="18"/>
         </w:rPr>
-        <w:t xml:space="preserve">    // Count occurrences to resolve candidates</w:t>
+        <w:t xml:space="preserve">        IF A[i] == left_dom:  left_count  &lt;- left_count  + 1</w:t>
       </w:r>
     </w:p>
     <w:p>
@@ -2167,15 +1489,18 @@
         </w:pBdr>
         <w:shd w:val="clear" w:color="auto" w:fill="1E1E2E"/>
         <w:ind w:left="360" w:right="360"/>
-      </w:pPr>
-      <w:r>
-        <w:rPr>
-          <w:rFonts w:ascii="Courier New" w:eastAsia="Courier New" w:hAnsi="Courier New" w:cs="Courier New"/>
+        <w:rPr>
+          <w:rFonts w:ascii="Consolas" w:hAnsi="Consolas"/>
+        </w:rPr>
+      </w:pPr>
+      <w:r>
+        <w:rPr>
+          <w:rFonts w:ascii="Consolas" w:eastAsia="Courier New" w:hAnsi="Consolas" w:cs="Courier New"/>
           <w:color w:val="C9D1E0"/>
           <w:sz w:val="18"/>
           <w:szCs w:val="18"/>
         </w:rPr>
-        <w:t xml:space="preserve">    left_count  &lt;- 0</w:t>
+        <w:t xml:space="preserve">        IF A[i] == right_dom: right_count &lt;- right_count + 1</w:t>
       </w:r>
     </w:p>
     <w:p>
@@ -2185,15 +1510,18 @@
         </w:pBdr>
         <w:shd w:val="clear" w:color="auto" w:fill="1E1E2E"/>
         <w:ind w:left="360" w:right="360"/>
-      </w:pPr>
-      <w:r>
-        <w:rPr>
-          <w:rFonts w:ascii="Courier New" w:eastAsia="Courier New" w:hAnsi="Courier New" w:cs="Courier New"/>
+        <w:rPr>
+          <w:rFonts w:ascii="Consolas" w:hAnsi="Consolas"/>
+        </w:rPr>
+      </w:pPr>
+      <w:r>
+        <w:rPr>
+          <w:rFonts w:ascii="Consolas" w:eastAsia="Courier New" w:hAnsi="Consolas" w:cs="Courier New"/>
           <w:color w:val="C9D1E0"/>
           <w:sz w:val="18"/>
           <w:szCs w:val="18"/>
         </w:rPr>
-        <w:t xml:space="preserve">    right_count &lt;- 0</w:t>
+        <w:t xml:space="preserve"> </w:t>
       </w:r>
     </w:p>
     <w:p>
@@ -2203,15 +1531,18 @@
         </w:pBdr>
         <w:shd w:val="clear" w:color="auto" w:fill="1E1E2E"/>
         <w:ind w:left="360" w:right="360"/>
-      </w:pPr>
-      <w:r>
-        <w:rPr>
-          <w:rFonts w:ascii="Courier New" w:eastAsia="Courier New" w:hAnsi="Courier New" w:cs="Courier New"/>
+        <w:rPr>
+          <w:rFonts w:ascii="Consolas" w:hAnsi="Consolas"/>
+        </w:rPr>
+      </w:pPr>
+      <w:r>
+        <w:rPr>
+          <w:rFonts w:ascii="Consolas" w:eastAsia="Courier New" w:hAnsi="Consolas" w:cs="Courier New"/>
           <w:color w:val="C9D1E0"/>
           <w:sz w:val="18"/>
           <w:szCs w:val="18"/>
         </w:rPr>
-        <w:t xml:space="preserve">    FOR i FROM left TO right:</w:t>
+        <w:t xml:space="preserve">    IF left_count &gt; right_count:</w:t>
       </w:r>
     </w:p>
     <w:p>
@@ -2221,15 +1552,18 @@
         </w:pBdr>
         <w:shd w:val="clear" w:color="auto" w:fill="1E1E2E"/>
         <w:ind w:left="360" w:right="360"/>
-      </w:pPr>
-      <w:r>
-        <w:rPr>
-          <w:rFonts w:ascii="Courier New" w:eastAsia="Courier New" w:hAnsi="Courier New" w:cs="Courier New"/>
+        <w:rPr>
+          <w:rFonts w:ascii="Consolas" w:hAnsi="Consolas"/>
+        </w:rPr>
+      </w:pPr>
+      <w:r>
+        <w:rPr>
+          <w:rFonts w:ascii="Consolas" w:eastAsia="Courier New" w:hAnsi="Consolas" w:cs="Courier New"/>
           <w:color w:val="C9D1E0"/>
           <w:sz w:val="18"/>
           <w:szCs w:val="18"/>
         </w:rPr>
-        <w:t xml:space="preserve">        IF A[i] == left_dom:  left_count  &lt;- left_count  + 1</w:t>
+        <w:t xml:space="preserve">        RETURN left_dom</w:t>
       </w:r>
     </w:p>
     <w:p>
@@ -2239,82 +1573,13 @@
         </w:pBdr>
         <w:shd w:val="clear" w:color="auto" w:fill="1E1E2E"/>
         <w:ind w:left="360" w:right="360"/>
-      </w:pPr>
-      <w:r>
-        <w:rPr>
-          <w:rFonts w:ascii="Courier New" w:eastAsia="Courier New" w:hAnsi="Courier New" w:cs="Courier New"/>
-          <w:color w:val="C9D1E0"/>
-          <w:sz w:val="18"/>
-          <w:szCs w:val="18"/>
-        </w:rPr>
-        <w:t xml:space="preserve">        IF A[i] == right_dom: right_count &lt;- right_count + 1</w:t>
-      </w:r>
-    </w:p>
-    <w:p>
-      <w:pPr>
-        <w:pBdr>
-          <w:left w:val="single" w:sz="12" w:space="0" w:color="4A90C4"/>
-        </w:pBdr>
-        <w:shd w:val="clear" w:color="auto" w:fill="1E1E2E"/>
-        <w:ind w:left="360" w:right="360"/>
-      </w:pPr>
-      <w:r>
-        <w:rPr>
-          <w:rFonts w:ascii="Courier New" w:eastAsia="Courier New" w:hAnsi="Courier New" w:cs="Courier New"/>
-          <w:color w:val="C9D1E0"/>
-          <w:sz w:val="18"/>
-          <w:szCs w:val="18"/>
-        </w:rPr>
-        <w:t xml:space="preserve"> </w:t>
-      </w:r>
-    </w:p>
-    <w:p>
-      <w:pPr>
-        <w:pBdr>
-          <w:left w:val="single" w:sz="12" w:space="0" w:color="4A90C4"/>
-        </w:pBdr>
-        <w:shd w:val="clear" w:color="auto" w:fill="1E1E2E"/>
-        <w:ind w:left="360" w:right="360"/>
-      </w:pPr>
-      <w:r>
-        <w:rPr>
-          <w:rFonts w:ascii="Courier New" w:eastAsia="Courier New" w:hAnsi="Courier New" w:cs="Courier New"/>
-          <w:color w:val="C9D1E0"/>
-          <w:sz w:val="18"/>
-          <w:szCs w:val="18"/>
-        </w:rPr>
-        <w:t xml:space="preserve">    IF left_count &gt; right_count:</w:t>
-      </w:r>
-    </w:p>
-    <w:p>
-      <w:pPr>
-        <w:pBdr>
-          <w:left w:val="single" w:sz="12" w:space="0" w:color="4A90C4"/>
-        </w:pBdr>
-        <w:shd w:val="clear" w:color="auto" w:fill="1E1E2E"/>
-        <w:ind w:left="360" w:right="360"/>
-      </w:pPr>
-      <w:r>
-        <w:rPr>
-          <w:rFonts w:ascii="Courier New" w:eastAsia="Courier New" w:hAnsi="Courier New" w:cs="Courier New"/>
-          <w:color w:val="C9D1E0"/>
-          <w:sz w:val="18"/>
-          <w:szCs w:val="18"/>
-        </w:rPr>
-        <w:t xml:space="preserve">        RETURN left_dom</w:t>
-      </w:r>
-    </w:p>
-    <w:p>
-      <w:pPr>
-        <w:pBdr>
-          <w:left w:val="single" w:sz="12" w:space="0" w:color="4A90C4"/>
-        </w:pBdr>
-        <w:shd w:val="clear" w:color="auto" w:fill="1E1E2E"/>
-        <w:ind w:left="360" w:right="360"/>
-      </w:pPr>
-      <w:r>
-        <w:rPr>
-          <w:rFonts w:ascii="Courier New" w:eastAsia="Courier New" w:hAnsi="Courier New" w:cs="Courier New"/>
+        <w:rPr>
+          <w:rFonts w:ascii="Consolas" w:hAnsi="Consolas"/>
+        </w:rPr>
+      </w:pPr>
+      <w:r>
+        <w:rPr>
+          <w:rFonts w:ascii="Consolas" w:eastAsia="Courier New" w:hAnsi="Consolas" w:cs="Courier New"/>
           <w:color w:val="C9D1E0"/>
           <w:sz w:val="18"/>
           <w:szCs w:val="18"/>
@@ -2332,7 +1597,7 @@
         <w:spacing w:after="80"/>
         <w:ind w:left="360" w:right="360"/>
         <w:rPr>
-          <w:rFonts w:ascii="Courier New" w:eastAsia="Courier New" w:hAnsi="Courier New" w:cs="Courier New"/>
+          <w:rFonts w:ascii="Consolas" w:eastAsia="Courier New" w:hAnsi="Consolas" w:cs="Courier New"/>
           <w:color w:val="C9D1E0"/>
           <w:sz w:val="18"/>
           <w:szCs w:val="18"/>
@@ -2341,7 +1606,7 @@
       </w:pPr>
       <w:r>
         <w:rPr>
-          <w:rFonts w:ascii="Courier New" w:eastAsia="Courier New" w:hAnsi="Courier New" w:cs="Courier New"/>
+          <w:rFonts w:ascii="Consolas" w:eastAsia="Courier New" w:hAnsi="Consolas" w:cs="Courier New"/>
           <w:color w:val="C9D1E0"/>
           <w:sz w:val="18"/>
           <w:szCs w:val="18"/>
@@ -3220,8 +2485,17 @@
     <w:p>
       <w:pPr>
         <w:pStyle w:val="Heading2"/>
-      </w:pPr>
-      <w:r>
+        <w:rPr>
+          <w:lang w:val="en-US"/>
+        </w:rPr>
+      </w:pPr>
+    </w:p>
+    <w:p>
+      <w:pPr>
+        <w:pStyle w:val="Heading2"/>
+      </w:pPr>
+      <w:r>
+        <w:lastRenderedPageBreak/>
         <w:t>Total number of levels: log</w:t>
       </w:r>
       <w:r>
@@ -6200,19 +5474,8 @@
         </w:rPr>
       </w:pPr>
     </w:p>
-    <w:p>
-      <w:r>
-        <w:br w:type="page"/>
-      </w:r>
-      <w:r>
-        <w:lastRenderedPageBreak/>
-        <w:br w:type="page"/>
-      </w:r>
-    </w:p>
-    <w:p/>
     <w:sectPr>
-      <w:headerReference w:type="default" r:id="rId8"/>
-      <w:footerReference w:type="default" r:id="rId9"/>
+      <w:footerReference w:type="default" r:id="rId8"/>
       <w:pgSz w:w="12240" w:h="15840"/>
       <w:pgMar w:top="1200" w:right="1260" w:bottom="1200" w:left="1260" w:header="708" w:footer="708" w:gutter="0"/>
       <w:cols w:space="720"/>
@@ -6277,25 +5540,6 @@
     </w:p>
   </w:footnote>
 </w:footnotes>
-</file>
-
-<file path=word/header1.xml><?xml version="1.0" encoding="utf-8"?>
-<w:hdr xmlns:wpc="http://schemas.microsoft.com/office/word/2010/wordprocessingCanvas" xmlns:cx="http://schemas.microsoft.com/office/drawing/2014/chartex" xmlns:cx1="http://schemas.microsoft.com/office/drawing/2015/9/8/chartex" xmlns:cx2="http://schemas.microsoft.com/office/drawing/2015/10/21/chartex" xmlns:cx3="http://schemas.microsoft.com/office/drawing/2016/5/9/chartex" xmlns:cx4="http://schemas.microsoft.com/office/drawing/2016/5/10/chartex" xmlns:cx5="http://schemas.microsoft.com/office/drawing/2016/5/11/chartex" xmlns:cx6="http://schemas.microsoft.com/office/drawing/2016/5/12/chartex" xmlns:cx7="http://schemas.microsoft.com/office/drawing/2016/5/13/chartex" xmlns:cx8="http://schemas.microsoft.com/office/drawing/2016/5/14/chartex" xmlns:mc="http://schemas.openxmlformats.org/markup-compatibility/2006" xmlns:aink="http://schemas.microsoft.com/office/drawing/2016/ink" xmlns:am3d="http://schemas.microsoft.com/office/drawing/2017/model3d" xmlns:o="urn:schemas-microsoft-com:office:office" xmlns:oel="http://schemas.microsoft.com/office/2019/extlst" xmlns:r="http://schemas.openxmlformats.org/officeDocument/2006/relationships" xmlns:m="http://schemas.openxmlformats.org/officeDocument/2006/math" xmlns:v="urn:schemas-microsoft-com:vml" xmlns:wp14="http://schemas.microsoft.com/office/word/2010/wordprocessingDrawing" xmlns:wp="http://schemas.openxmlformats.org/drawingml/2006/wordprocessingDrawing" xmlns:w10="urn:schemas-microsoft-com:office:word" xmlns:w="http://schemas.openxmlformats.org/wordprocessingml/2006/main" xmlns:w14="http://schemas.microsoft.com/office/word/2010/wordml" xmlns:w15="http://schemas.microsoft.com/office/word/2012/wordml" xmlns:w16cex="http://schemas.microsoft.com/office/word/2018/wordml/cex" xmlns:w16cid="http://schemas.microsoft.com/office/word/2016/wordml/cid" xmlns:w16="http://schemas.microsoft.com/office/word/2018/wordml" xmlns:w16du="http://schemas.microsoft.com/office/word/2023/wordml/word16du" xmlns:w16sdtdh="http://schemas.microsoft.com/office/word/2020/wordml/sdtdatahash" xmlns:w16sdtfl="http://schemas.microsoft.com/office/word/2024/wordml/sdtformatlock" xmlns:w16se="http://schemas.microsoft.com/office/word/2015/wordml/symex" xmlns:wpg="http://schemas.microsoft.com/office/word/2010/wordprocessingGroup" xmlns:wpi="http://schemas.microsoft.com/office/word/2010/wordprocessingInk" xmlns:wne="http://schemas.microsoft.com/office/word/2006/wordml" xmlns:wps="http://schemas.microsoft.com/office/word/2010/wordprocessingShape" mc:Ignorable="w14 w15 w16se w16cid w16 w16cex w16sdtdh w16sdtfl w16du wp14">
-  <w:p>
-    <w:pPr>
-      <w:pBdr>
-        <w:bottom w:val="single" w:sz="6" w:space="0" w:color="2E6DA4"/>
-      </w:pBdr>
-      <w:tabs>
-        <w:tab w:val="right" w:pos="9026"/>
-      </w:tabs>
-      <w:spacing w:after="120"/>
-      <w:rPr>
-        <w:lang w:val="en-US"/>
-      </w:rPr>
-    </w:pPr>
-  </w:p>
-</w:hdr>
 </file>
 
 <file path=word/numbering.xml><?xml version="1.0" encoding="utf-8"?>

</xml_diff>